<commit_message>
docs: update mass input guide with new mandatory template rules
</commit_message>
<xml_diff>
--- a/Panduan_Input_Massal_Catat_Pemakaian.docx
+++ b/Panduan_Input_Massal_Catat_Pemakaian.docx
@@ -13,7 +13,7 @@
     </w:p>
     <w:p>
       <w:r>
-        <w:t>Fitur Input Masal (Catat Pemakaian) memungkinkan Anda untuk memasukkan data pemakaian secara massal langsung dari Microsoft Excel ke dalam sistem. Fitur ini sekarang mendukung pengisian lengkap per baris, termasuk Penerima, Tanggal, dan informasi Kendaraan/Kapal/Alat Berat.</w:t>
+        <w:t>Fitur Input Masal (Catat Pemakaian) kini telah diperbarui. Form pengisian Nama Penerima, Tanggal, dan Keterangan di luar kotak paste telah DIHAPUS. Anda SEKARANG WAJIB memasukkan semua data utama langsung ke dalam format urutan saat Anda mem-paste data dari Excel.</w:t>
       </w:r>
     </w:p>
     <w:p>
@@ -26,7 +26,7 @@
     </w:p>
     <w:p>
       <w:r>
-        <w:t>Ketika Anda menyiapkan data di Excel, pastikan urutan kolom dari kiri ke kanan adalah sebagai berikut:</w:t>
+        <w:t>Ketika Anda menyiapkan data di Excel, pastikan urutan kolom dari kiri ke kanan adalah tepat 10 kolom sebagai berikut:</w:t>
       </w:r>
     </w:p>
     <w:p>
@@ -34,7 +34,7 @@
         <w:pStyle w:val="ListBullet"/>
       </w:pPr>
       <w:r>
-        <w:t>Kolom 1: ID Stock atau Nama Barang (Wajib)</w:t>
+        <w:t>Kolom 1: ID Stock atau Nama Barang (WAJIB)</w:t>
       </w:r>
     </w:p>
     <w:p>
@@ -42,7 +42,7 @@
         <w:pStyle w:val="ListBullet"/>
       </w:pPr>
       <w:r>
-        <w:t>Kolom 2: Jumlah Ambil (Wajib)</w:t>
+        <w:t>Kolom 2: Jumlah Ambil (WAJIB)</w:t>
       </w:r>
     </w:p>
     <w:p>
@@ -50,7 +50,7 @@
         <w:pStyle w:val="ListBullet"/>
       </w:pPr>
       <w:r>
-        <w:t>Kolom 3: Nama Penerima (Opsional)</w:t>
+        <w:t>Kolom 3: Nama Penerima (WAJIB)</w:t>
       </w:r>
     </w:p>
     <w:p>
@@ -58,7 +58,7 @@
         <w:pStyle w:val="ListBullet"/>
       </w:pPr>
       <w:r>
-        <w:t>Kolom 4: Tanggal Pengambilan format YYYY-MM-DD (Opsional)</w:t>
+        <w:t>Kolom 4: Tanggal Pengambilan format YYYY-MM-DD (WAJIB)</w:t>
       </w:r>
     </w:p>
     <w:p>
@@ -66,7 +66,7 @@
         <w:pStyle w:val="ListBullet"/>
       </w:pPr>
       <w:r>
-        <w:t>Kolom 5: Keterangan Umum (Opsional)</w:t>
+        <w:t>Kolom 5: Keterangan Umum (WAJIB)</w:t>
       </w:r>
     </w:p>
     <w:p>
@@ -111,13 +111,13 @@
     </w:p>
     <w:p>
       <w:r>
-        <w:t xml:space="preserve">Catatan Penting: </w:t>
+        <w:t xml:space="preserve">Peringatan Keras: </w:t>
       </w:r>
       <w:r>
         <w:rPr>
           <w:b/>
         </w:rPr>
-        <w:t>Hanya kolom 1 dan 2 yang wajib diisi. Kolom 3 dan seterusnya bersifat opsional. Jika kosong di template, sistem akan mencoba mengambil data dari form isian (dropdown/tanggal) yang ada di atas kotak teks.</w:t>
+        <w:t>Jika Anda mengosongkan salah satu dari Kolom 1 sampai Kolom 5, maka sistem akan menolak dan menggagalkan input baris tersebut.</w:t>
       </w:r>
     </w:p>
     <w:p>
@@ -125,12 +125,12 @@
         <w:pStyle w:val="Heading1"/>
       </w:pPr>
       <w:r>
-        <w:t>2. Cara Melewati Kolom</w:t>
+        <w:t>2. Cara Melewati Kolom Kendaraan/Kapal/Alat Berat</w:t>
       </w:r>
     </w:p>
     <w:p>
       <w:r>
-        <w:t>Jika Anda tidak ingin mengisi suatu kolom (misalnya: Anda hanya ingin mengisi Nama Kapal di kolom 9, tetapi kolom 6, 7, dan 8 kosong), Anda wajib memberikan jarak kolom kosong di Excel Anda, atau menuliskan tanda titik koma (;) kosong saat mem-paste.</w:t>
+        <w:t>Kolom 6 sampai 10 bersifat opsional. Jika Anda ingin melompat ke kolom tertentu, Anda harus membiarkan kolom sebelumnya kosong (di Excel) atau memberikan tanda titik koma (;) kosong saat mem-paste teks.</w:t>
       </w:r>
     </w:p>
     <w:p>
@@ -156,7 +156,7 @@
     </w:p>
     <w:p>
       <w:r>
-        <w:t>Oli Mesin ; 1 ; Budi ; 2026-07-10 ; Ganti Rutin ; BP 1234 XX</w:t>
+        <w:t>Oli Mesin ; 1 ; Budi Santoso ; 2026-07-10 ; Ganti Rutin ; BP 1234 XX</w:t>
       </w:r>
     </w:p>
     <w:p>
@@ -169,12 +169,12 @@
     </w:p>
     <w:p>
       <w:r>
-        <w:t>Lewati kolom 6, 7, 8 dengan mengosongkannya, lalu isi kolom 9:</w:t>
+        <w:t>Lewati kolom 6, 7, 8 dengan mengosongkannya, lalu isi nama kapal di kolom 9:</w:t>
       </w:r>
     </w:p>
     <w:p>
       <w:r>
-        <w:t>Oli Mesin ; 2 ; Joko ; 2026-07-10 ; Perawatan ; ; ; ; KM BINTANG</w:t>
+        <w:t>Oli Mesin ; 2 ; Joko Anwar ; 2026-07-10 ; Perawatan Mesin Utama ; ; ; ; KM BINTANG</w:t>
       </w:r>
     </w:p>
     <w:p>
@@ -187,12 +187,12 @@
     </w:p>
     <w:p>
       <w:r>
-        <w:t>Lewati kolom 6, 7, 8, 9, lalu isi kolom 10:</w:t>
+        <w:t>Lewati kolom 6, 7, 8, 9, lalu isi kode di kolom 10:</w:t>
       </w:r>
     </w:p>
     <w:p>
       <w:r>
-        <w:t>Filter Oli ; 3 ; Supri ; 2026-07-10 ; Service ; ; ; ; ; EXC-001</w:t>
+        <w:t>Filter Oli ; 3 ; Supriyadi ; 2026-07-10 ; Service Berkala ; ; ; ; ; EXC-001</w:t>
       </w:r>
     </w:p>
     <w:p>
@@ -200,12 +200,41 @@
         <w:pStyle w:val="Heading1"/>
       </w:pPr>
       <w:r>
-        <w:t>3. Sistem Pengeluaran Stok (FIFO)</w:t>
+        <w:t>3. Sistem Pengeluaran Stok Otomatis (FIFO)</w:t>
       </w:r>
     </w:p>
     <w:p>
       <w:r>
-        <w:t>Sistem ini telah dilengkapi dengan teori FIFO (First In, First Out). Anda cukup menyebutkan "Nama Barang", dan sistem akan otomatis mencari stok yang dibeli paling lama (tertua) dan memotongnya terlebih dahulu. Jika stok lama habis, sistem akan otomatis berpindah memotong sisa kuantitas ke stok yang lebih baru (cascade).</w:t>
+        <w:t>Sistem ini telah dilengkapi dengan teori FIFO (First In, First Out). Anda cukup menuliskan "Nama Barang" dan Jumlahnya saja di dalam template. Sistem akan otomatis:</w:t>
+      </w:r>
+    </w:p>
+    <w:p>
+      <w:pPr>
+        <w:pStyle w:val="ListBullet"/>
+      </w:pPr>
+      <w:r>
+        <w:t>Mencari stok barang tersebut di gudang yang dibeli/masuk paling lama (tertua).</w:t>
+      </w:r>
+    </w:p>
+    <w:p>
+      <w:pPr>
+        <w:pStyle w:val="ListBullet"/>
+      </w:pPr>
+      <w:r>
+        <w:t>Memotong stok tertua tersebut terlebih dahulu.</w:t>
+      </w:r>
+    </w:p>
+    <w:p>
+      <w:pPr>
+        <w:pStyle w:val="ListBullet"/>
+      </w:pPr>
+      <w:r>
+        <w:t>Jika stok tertua kurang dari jumlah yang diminta, sistem otomatis memotong sisa kekurangannya dari stok yang lebih baru secara berurutan (cascade).</w:t>
+      </w:r>
+    </w:p>
+    <w:p>
+      <w:r>
+        <w:t>Hal ini menyebabkan satu baris input di Excel Anda bisa menghasilkan beberapa baris riwayat pemakaian di dalam sistem jika sistem terpaksa mengambil dari dua batch pembelian yang berbeda.</w:t>
       </w:r>
     </w:p>
     <w:sectPr>

</xml_diff>